<commit_message>
Retrain on HPR exterior scenes and update SAIMM manuscript
</commit_message>
<xml_diff>
--- a/manuscript/saimm_cover_letter.docx
+++ b/manuscript/saimm_cover_letter.docx
@@ -65,7 +65,7 @@
         <w:jc w:val="left"/>
       </w:pPr>
       <w:r>
-        <w:t>The manuscript is aligned with the Journal's mining, blasting, digitalisation, and mine-to-mill interests. It presents a reproducible synthetic benchmark in which rock-like fragments are generated first, assembled into labelled rockpile scenes, converted to exterior-only point-cloud scan proxies, and used to evaluate EdgeConv edge-affinity learning and several baseline clustering methods for visible-surface size-distribution proxy estimation.</w:t>
+        <w:t>The manuscript is aligned with the Journal's mining, blasting, digitalisation, and mine-to-mill interests. It presents a reproducible synthetic benchmark in which rock-like fragments are generated first, assembled into labelled rockpile scenes, converted to exterior-only point-cloud scan proxies using multi-view Hidden Point Removal, and used to evaluate EdgeConv edge-affinity learning and several baseline clustering methods for visible-surface size-distribution proxy estimation.</w:t>
       </w:r>
     </w:p>
     <w:p>
@@ -74,7 +74,7 @@
         <w:jc w:val="left"/>
       </w:pPr>
       <w:r>
-        <w:t>The main novelty is the separation of labelled pile construction, exterior-only scan visibility, and final particle-size proxy recovery. The latest 100-scene, 150-fragment benchmark uses a 60:20:20 train, validation, and test split and compares EdgeConv with graph-threshold, density, region-growing, and multilayer perceptron edge-affinity baselines.</w:t>
+        <w:t>The main novelty is the separation of labelled pile construction, exterior-only scan visibility, and final particle-size proxy recovery. The latest 100-scene, 150-fragment benchmark uses a 60:20:20 train, validation, and test split and compares EdgeConv with graph-threshold, density, region-growing, and multilayer perceptron edge-affinity baselines. The revised HPR experiment shows that EdgeConv learns stronger fragment-aware affinity than the shallow baseline, but that P80 proxy recovery still requires PSD-aware component calibration.</w:t>
       </w:r>
     </w:p>
     <w:p>

</xml_diff>

<commit_message>
Add exterior PSD calibration and final SAIMM manuscript
</commit_message>
<xml_diff>
--- a/manuscript/saimm_cover_letter.docx
+++ b/manuscript/saimm_cover_letter.docx
@@ -8,7 +8,7 @@
         <w:jc w:val="left"/>
       </w:pPr>
       <w:r>
-        <w:t>22 June 2026</w:t>
+        <w:t>23 June 2026</w:t>
       </w:r>
     </w:p>
     <w:p>
@@ -74,7 +74,7 @@
         <w:jc w:val="left"/>
       </w:pPr>
       <w:r>
-        <w:t>The main novelty is the separation of labelled pile construction, exterior-only scan visibility, and final particle-size proxy recovery. The latest 100-scene, 150-fragment benchmark uses a 60:20:20 train, validation, and test split and compares EdgeConv with graph-threshold, density, region-growing, and multilayer perceptron edge-affinity baselines. The revised HPR experiment shows that EdgeConv learns stronger fragment-aware affinity than the shallow baseline, but that P80 proxy recovery still requires PSD-aware component calibration.</w:t>
+        <w:t>The main novelty is the separation of labelled pile construction, exterior-only scan visibility, and final particle-size proxy recovery. The latest 100-scene, 150-fragment benchmark uses a 60:20:20 train, validation, and test split and compares EdgeConv with graph-threshold, density, region-growing, and multilayer perceptron edge-affinity baselines. The revised HPR experiment separates segmentation performance, exterior-proxy P80 performance, and validation-calibrated full-PSD performance. This separation shows that EdgeConv learns stronger fragment-aware affinity than the shallow baseline and that exterior-to-full PSD calibration is required because even oracle exterior labels are biased relative to the full pile.</w:t>
       </w:r>
     </w:p>
     <w:p>
@@ -500,13 +500,13 @@
     <w:qFormat/>
     <w:rsid w:val="00FC693F"/>
     <w:pPr>
-      <w:spacing w:line="360" w:lineRule="auto" w:after="120"/>
+      <w:spacing w:line="276" w:lineRule="auto" w:after="60"/>
       <w:jc w:val="left"/>
     </w:pPr>
     <w:rPr>
       <w:rFonts w:ascii="Arial" w:hAnsi="Arial" w:eastAsia="Arial"/>
       <w:color w:val="000000"/>
-      <w:sz w:val="22"/>
+      <w:sz w:val="20"/>
     </w:rPr>
   </w:style>
   <w:style w:type="paragraph" w:styleId="Header">

</xml_diff>

<commit_message>
Reframe manuscript around diagnostic PSD calibration
</commit_message>
<xml_diff>
--- a/manuscript/saimm_cover_letter.docx
+++ b/manuscript/saimm_cover_letter.docx
@@ -56,7 +56,7 @@
         <w:jc w:val="left"/>
       </w:pPr>
       <w:r>
-        <w:t>Please consider the manuscript entitled "Synthetic exterior point-cloud benchmark for rockpile fragmentation: fragment generation, rockpile construction, EdgeConv learning, and size-distribution proxy evaluation" for publication in the Journal of the Southern African Institute of Mining and Metallurgy.</w:t>
+        <w:t>Please consider the manuscript entitled "Synthetic exterior point-cloud benchmarking for fragment-aware rockpile PSD proxy estimation" for publication in the Journal of the Southern African Institute of Mining and Metallurgy.</w:t>
       </w:r>
     </w:p>
     <w:p>
@@ -74,7 +74,7 @@
         <w:jc w:val="left"/>
       </w:pPr>
       <w:r>
-        <w:t>The main novelty is the separation of labelled pile construction, exterior-only scan visibility, and final particle-size proxy recovery. The latest 100-scene, 150-fragment benchmark uses a 60:20:20 train, validation, and test split and compares EdgeConv with graph-threshold, density, region-growing, and multilayer perceptron edge-affinity baselines. The revised HPR experiment separates segmentation performance, exterior-proxy P80 performance, and validation-calibrated full-PSD performance. This separation shows that EdgeConv learns stronger fragment-aware affinity than the shallow baseline and that exterior-to-full PSD calibration is required because even oracle exterior labels are biased relative to the full pile.</w:t>
+        <w:t>The main novelty is the separation of labelled pile construction, exterior-only scan visibility, and final particle-size proxy recovery. The latest 100-scene, 150-fragment benchmark uses a 60:20:20 train, validation, and test split and compares EdgeConv with graph-threshold, density, region-growing, and multilayer perceptron edge-affinity baselines. The revised HPR experiment separates segmentation performance, exterior-proxy P80 performance, and validation-calibrated full-PSD performance. The manuscript does not claim that EdgeConv is the best direct P80 estimator; instead, it shows how a controlled benchmark can diagnose whether error originates from fragment partitioning, exterior observation bias, or exterior-to-full PSD calibration.</w:t>
       </w:r>
     </w:p>
     <w:p>

</xml_diff>